<commit_message>
fix: Modell-Tag qwen3:72b existiert nicht — Umstellung auf qwen3:32b
ollama pull qwen3:72b schlug fehl (manifest does not exist): Qwen3
gibt es nicht in 72B — diese Groesse stammte aus der Qwen2.5-Reihe.
Neuer Default: qwen3:32b (~20 GB Q4, neueste Generation, passt
komfortabel in die 128 GB Unified Memory).

- Ersetzt in .env.example, setup_dgx.sh, smoke_test.py, Systemstatus,
  llm-service-Default, Modell-Katalog-Seed, README, Anleitung (docx neu)
- Groessenangaben korrigiert (42 GB -> 20 GB)
- Zusaetzlicher Fix: Smoke-Test prueft Keycloak jetzt unter
  /auth/realms (Pfad seit der Caddy/HTTPS-Umstellung)

Co-Authored-By: Claude Fable 5 <noreply@anthropic.com>
</commit_message>
<xml_diff>
--- a/docs/Installationsanleitung-DRK-DGX-Spark.docx
+++ b/docs/Installationsanleitung-DRK-DGX-Spark.docx
@@ -301,7 +301,7 @@
                 <w:sz w:val="20"/>
                 <w:szCs w:val="20"/>
               </w:rPr>
-              <w:t xml:space="preserve">Qwen3 72B via Ollama (lokal) — optional externe Modelle</w:t>
+              <w:t xml:space="preserve">Qwen3 32B via Ollama (lokal) — optional externe Modelle</w:t>
             </w:r>
           </w:p>
         </w:tc>
@@ -2111,7 +2111,7 @@
                 <w:sz w:val="19"/>
                 <w:szCs w:val="19"/>
               </w:rPr>
-              <w:t xml:space="preserve">Für Qwen3 72B + OS + Daten reicht 1 TB</w:t>
+              <w:t xml:space="preserve">Für Qwen3 32B + OS + Daten reicht 1 TB</w:t>
             </w:r>
           </w:p>
         </w:tc>
@@ -4373,7 +4373,7 @@
           <w:sz w:val="20"/>
           <w:szCs w:val="20"/>
         </w:rPr>
-        <w:t xml:space="preserve">Sprachmodelle laden: Qwen3 72B (~42 GB) und nomic-embed-text — Download je nach Anbindung 30–90 Minuten</w:t>
+        <w:t xml:space="preserve">Sprachmodelle laden: Qwen3 32B (~20 GB) und nomic-embed-text — Download je nach Anbindung 15–45 Minuten</w:t>
       </w:r>
     </w:p>
     <w:p>
@@ -4491,7 +4491,7 @@
                 <w:sz w:val="19"/>
                 <w:szCs w:val="19"/>
               </w:rPr>
-              <w:t xml:space="preserve">✅ Modell: qwen3:72b      ✅ Modell: nomic-embed-text</w:t>
+              <w:t xml:space="preserve">✅ Modell: qwen3:32b      ✅ Modell: nomic-embed-text</w:t>
             </w:r>
           </w:p>
           <w:p>
@@ -9653,7 +9653,7 @@
                 <w:sz w:val="18"/>
                 <w:szCs w:val="18"/>
               </w:rPr>
-              <w:t xml:space="preserve">docker compose exec ollama ollama pull qwen3:72b</w:t>
+              <w:t xml:space="preserve">docker compose exec ollama ollama pull qwen3:32b</w:t>
             </w:r>
           </w:p>
         </w:tc>
@@ -10551,7 +10551,7 @@
                 <w:sz w:val="19"/>
                 <w:szCs w:val="19"/>
               </w:rPr>
-              <w:t xml:space="preserve">docker compose exec ollama ollama pull qwen3:72b (bzw. nomic-embed-text)</w:t>
+              <w:t xml:space="preserve">docker compose exec ollama ollama pull qwen3:32b (bzw. nomic-embed-text)</w:t>
             </w:r>
           </w:p>
         </w:tc>

</xml_diff>